<commit_message>
fix: update Google Maps embed ke lokasi asli Drg. Marlin H - Cibadak & Lembang
</commit_message>
<xml_diff>
--- a/Manual_Book_SIGIGI_2.0_REVISED.docx
+++ b/Manual_Book_SIGIGI_2.0_REVISED.docx
@@ -4257,7 +4257,35 @@
         <w:rPr>
           <w:color w:val="000000" w:themeColor="text1"/>
         </w:rPr>
-        <w:t>Buka https://sigigi.my.id melalui browser.</w:t>
+        <w:t xml:space="preserve">Buka </w:t>
+      </w:r>
+      <w:hyperlink r:id="rId8" w:history="1">
+        <w:r>
+          <w:rPr>
+            <w:rStyle w:val="Hyperlink"/>
+          </w:rPr>
+          <w:t>https://sigigi.my.id/auth/login</w:t>
+        </w:r>
+      </w:hyperlink>
+      <w:r>
+        <w:rPr>
+          <w:color w:val="000000" w:themeColor="text1"/>
+        </w:rPr>
+        <w:t xml:space="preserve"> </w:t>
+      </w:r>
+      <w:proofErr w:type="spellStart"/>
+      <w:r>
+        <w:rPr>
+          <w:color w:val="000000" w:themeColor="text1"/>
+        </w:rPr>
+        <w:t>melalui</w:t>
+      </w:r>
+      <w:proofErr w:type="spellEnd"/>
+      <w:r>
+        <w:rPr>
+          <w:color w:val="000000" w:themeColor="text1"/>
+        </w:rPr>
+        <w:t xml:space="preserve"> browser.</w:t>
       </w:r>
     </w:p>
     <w:p>
@@ -6703,11 +6731,6 @@
           <w:color w:val="000000" w:themeColor="text1"/>
         </w:rPr>
         <w:t>Tujuan fitur: Membantu proses pencatatan tindakan medis, resep, odontogram, dan rekam medis pasien. Catatan: Modul tindakan juga dapat diakses langsung melalui Portal Dokter. Lihat Bab 4 untuk panduan lengkap fitur dokter.</w:t>
-      </w:r>
-      <w:r>
-        <w:rPr>
-          <w:color w:val="000000" w:themeColor="text1"/>
-        </w:rPr>
       </w:r>
     </w:p>
     <w:p>
@@ -12486,6 +12509,7 @@
         <w:rPr>
           <w:color w:val="000000" w:themeColor="text1"/>
         </w:rPr>
+        <w:lastRenderedPageBreak/>
         <w:br w:type="page"/>
       </w:r>
     </w:p>
@@ -16410,11 +16434,6 @@
         </w:rPr>
         <w:t>[✔] URL deployment sudah diperbarui menjadi https://sigigi.my.id.</w:t>
       </w:r>
-      <w:r>
-        <w:rPr>
-          <w:color w:val="000000" w:themeColor="text1"/>
-        </w:rPr>
-      </w:r>
     </w:p>
     <w:p>
       <w:pPr>
@@ -16619,8 +16638,8 @@
       </w:r>
     </w:p>
     <w:sectPr>
-      <w:headerReference w:type="default" r:id="rId8"/>
-      <w:footerReference w:type="default" r:id="rId9"/>
+      <w:headerReference w:type="default" r:id="rId9"/>
+      <w:footerReference w:type="default" r:id="rId10"/>
       <w:pgSz w:w="12240" w:h="15840"/>
       <w:pgMar w:top="1080" w:right="1224" w:bottom="1080" w:left="1224" w:header="720" w:footer="720" w:gutter="0"/>
       <w:cols w:space="720"/>
@@ -28395,6 +28414,29 @@
       <w:sz w:val="18"/>
     </w:rPr>
   </w:style>
+  <w:style w:type="character" w:styleId="Hyperlink">
+    <w:name w:val="Hyperlink"/>
+    <w:basedOn w:val="DefaultParagraphFont"/>
+    <w:uiPriority w:val="99"/>
+    <w:unhideWhenUsed/>
+    <w:rsid w:val="0033114D"/>
+    <w:rPr>
+      <w:color w:val="0000FF" w:themeColor="hyperlink"/>
+      <w:u w:val="single"/>
+    </w:rPr>
+  </w:style>
+  <w:style w:type="character" w:styleId="UnresolvedMention">
+    <w:name w:val="Unresolved Mention"/>
+    <w:basedOn w:val="DefaultParagraphFont"/>
+    <w:uiPriority w:val="99"/>
+    <w:semiHidden/>
+    <w:unhideWhenUsed/>
+    <w:rsid w:val="0033114D"/>
+    <w:rPr>
+      <w:color w:val="605E5C"/>
+      <w:shd w:val="clear" w:color="auto" w:fill="E1DFDD"/>
+    </w:rPr>
+  </w:style>
 </w:styles>
 </file>
 

</xml_diff>